<commit_message>
Overviews: Brian's edits, brought up to the current state
Oct 21: Persona Chat's October 21 simulated-student testing and fixes, and
what is still untested. Oct 13: readiness checks correct a false fact in
one sentence; live sync alongside the backup; the state of user testing;
the closing documentation line restored.

Co-Authored-By: Claude Opus 5.5 <noreply@anthropic.com>
</commit_message>
<xml_diff>
--- a/docs/LTI-Tutor-Overview-Oct13.docx
+++ b/docs/LTI-Tutor-Overview-Oct13.docx
@@ -13,15 +13,7 @@
           <w:sz w:val="44"/>
           <w:szCs w:val="44"/>
         </w:rPr>
-        <w:t xml:space="preserve">LTI Tutor </w:t>
-      </w:r>
-      <w:r>
-        <w:rPr>
-          <w:color w:val="1F2430"/>
-          <w:sz w:val="44"/>
-          <w:szCs w:val="44"/>
-        </w:rPr>
-        <w:t>Overview</w:t>
+        <w:t xml:space="preserve">LTI Tutor Overview</w:t>
       </w:r>
     </w:p>
     <w:p>
@@ -34,23 +26,7 @@
           <w:sz w:val="24"/>
           <w:szCs w:val="24"/>
         </w:rPr>
-        <w:t xml:space="preserve">A </w:t>
-      </w:r>
-      <w:r>
-        <w:rPr>
-          <w:color w:val="5D6474"/>
-          <w:sz w:val="24"/>
-          <w:szCs w:val="24"/>
-        </w:rPr>
-        <w:t>on</w:t>
-      </w:r>
-      <w:r>
-        <w:rPr>
-          <w:color w:val="5D6474"/>
-          <w:sz w:val="24"/>
-          <w:szCs w:val="24"/>
-        </w:rPr>
-        <w:t xml:space="preserve"> what this tool is, how it sits inside a course design, and where it stands on the questions we all have about generative AI in courses.</w:t>
+        <w:t xml:space="preserve">An overview of what this tool is, how it sits inside a Moodle course design, and how it relates to the questions we all have about generative AI in courses.</w:t>
       </w:r>
     </w:p>
     <w:p>
@@ -58,7 +34,7 @@
         <w:spacing w:after="160" w:line="300" w:lineRule="auto"/>
       </w:pPr>
       <w:r>
-        <w:t>Most GenAI tools offered to education generate content. This one is built on the opposite premise. It asks questions, following a brief the course author writes, and it draws only on the materials the course gives it. The learner does the thinking; the instructor keeps the authority; nothing it produces is a grade, a lesson or a submission. This guide takes that premise seriously, including where it falls short.</w:t>
+        <w:t xml:space="preserve">Most GenAI tools offer to generate content. This one is built on the opposite premise. It asks questions, following a brief the course author writes, and it draws only on the materials the course gives it. The learner does the thinking; the instructor keeps the authority; nothing it produces is a grade, a lesson or a submission. </w:t>
       </w:r>
     </w:p>
     <w:p>
@@ -95,15 +71,7 @@
         <w:t>brief</w:t>
       </w:r>
       <w:r>
-        <w:t xml:space="preserve">: a page of plain prose the course author (or you, with them) writes, in the voice of notes to a good teaching assistant. A learning goal, an opening question, the three to five probes to work through, the misconceptions to listen for, and what "got it" sounds like. The tutor follows the brief; the brief is reviewable, </w:t>
-      </w:r>
-      <w:proofErr w:type="spellStart"/>
-      <w:r>
-        <w:t>versionable</w:t>
-      </w:r>
-      <w:proofErr w:type="spellEnd"/>
-      <w:r>
-        <w:t xml:space="preserve"> text, not a prompt buried in a product.</w:t>
+        <w:t xml:space="preserve">: a page of plain prose the course author (or you, with them) writes, in the voice of notes to a good teaching assistant. A learning goal, an opening question, the three to five probes to work through, the misconceptions to listen for, and what "got it" sounds like. The tutor follows the brief; the brief is reviewable, versionable text, not a prompt buried in a product.</w:t>
       </w:r>
     </w:p>
     <w:p>
@@ -242,7 +210,7 @@
                 <w:sz w:val="20"/>
                 <w:szCs w:val="20"/>
               </w:rPr>
-              <w:t>Diagnostic before a unit. Misconceptions are noted, not corrected; the wrap-up says what to watch for.</w:t>
+              <w:t>Diagnostic before a unit. A false fact is corrected in one sentence, without teaching; the wrap-up says what to watch for.</w:t>
             </w:r>
           </w:p>
         </w:tc>
@@ -520,19 +488,8 @@
                 <w:szCs w:val="20"/>
               </w:rPr>
               <w:lastRenderedPageBreak/>
-              <w:t xml:space="preserve">Assignment </w:t>
+              <w:t xml:space="preserve">Assignment start</w:t>
             </w:r>
-            <w:proofErr w:type="gramStart"/>
-            <w:r>
-              <w:rPr>
-                <w:b/>
-                <w:bCs/>
-                <w:sz w:val="20"/>
-                <w:szCs w:val="20"/>
-              </w:rPr>
-              <w:t>start</w:t>
-            </w:r>
-            <w:proofErr w:type="gramEnd"/>
           </w:p>
         </w:tc>
         <w:tc>
@@ -596,23 +553,7 @@
         <w:t>It follows the delivery mode.</w:t>
       </w:r>
       <w:r>
-        <w:t xml:space="preserve"> A course is set to its </w:t>
-      </w:r>
-      <w:proofErr w:type="spellStart"/>
-      <w:r>
-        <w:t>TRUFlex</w:t>
-      </w:r>
-      <w:proofErr w:type="spellEnd"/>
-      <w:r>
-        <w:t xml:space="preserve"> mode once, and every session's wording keys on what the course </w:t>
-      </w:r>
-      <w:proofErr w:type="gramStart"/>
-      <w:r>
-        <w:t>actually has</w:t>
-      </w:r>
-      <w:proofErr w:type="gramEnd"/>
-      <w:r>
-        <w:t>: live sessions, a cohort, fixed dates. A self-paced, continuous-entry course never hears "before class" or "your classmates" and gets no date-based nudges; a paced course gets weekly grouping and "the cohort has moved on" reminders. The same deployment serves all ten modes, and docs/ALIGNMENT.md in the repository lists every wording switch.</w:t>
+        <w:t xml:space="preserve"> A course is set to its TRUFlex mode once, and every session's wording keys on what the course actually has: live sessions, a cohort, fixed dates. A self-paced, continuous-entry course never hears "before class" or "your classmates" and gets no date-based nudges; a paced course gets weekly grouping and "the cohort has moved on" reminders. The same deployment serves all ten modes, and docs/ALIGNMENT.md in the repository lists every wording switch.</w:t>
       </w:r>
     </w:p>
     <w:p>
@@ -639,30 +580,10 @@
           <w:b/>
           <w:bCs/>
         </w:rPr>
-        <w:t xml:space="preserve">It draws only on what the </w:t>
-      </w:r>
-      <w:r>
-        <w:rPr>
-          <w:b/>
-          <w:bCs/>
-        </w:rPr>
-        <w:t>designer</w:t>
-      </w:r>
-      <w:r>
-        <w:rPr>
-          <w:b/>
-          <w:bCs/>
-        </w:rPr>
-        <w:t xml:space="preserve"> gives it.</w:t>
-      </w:r>
-      <w:r>
-        <w:t xml:space="preserve"> Materials come from the course: a Moodle </w:t>
-      </w:r>
-      <w:r>
-        <w:t xml:space="preserve">course synch </w:t>
-      </w:r>
-      <w:r>
-        <w:t>brings the units in with their text, readings, activities and assignments, each marked for what it is. The course's own activity and study questions become the tutor's probes before it invents any. An assignment description is treated as the task, never as a source to teach from. If a session has no materials, the tutor is working from general knowledge, and the editor says so.</w:t>
+        <w:t xml:space="preserve">It draws only on what the designer gives it.</w:t>
+      </w:r>
+      <w:r>
+        <w:t xml:space="preserve"> Materials come from the course: a Moodle course synch brings the units in with their text, readings, activities and assignments, each marked for what it is. The course's own activity and study questions become the tutor's probes before it invents any. An assignment description is treated as the task, never as a source to teach from. If a session has no materials, the tutor is working from general knowledge, and the editor says so.</w:t>
       </w:r>
     </w:p>
     <w:p>
@@ -681,23 +602,7 @@
           <w:sz w:val="30"/>
           <w:szCs w:val="30"/>
         </w:rPr>
-        <w:t>3. The GenAI questions, answered plainly</w:t>
-      </w:r>
-    </w:p>
-    <w:p>
-      <w:pPr>
-        <w:spacing w:after="160" w:line="300" w:lineRule="auto"/>
-      </w:pPr>
-      <w:r>
-        <w:t xml:space="preserve">These are the questions IDs and OLFMs have </w:t>
-      </w:r>
-      <w:proofErr w:type="gramStart"/>
-      <w:r>
-        <w:t>asked, or</w:t>
-      </w:r>
-      <w:proofErr w:type="gramEnd"/>
-      <w:r>
-        <w:t xml:space="preserve"> should. The answers are what the tool does, not what we hope it does, and each names the limit.</w:t>
+        <w:t>3. The GenAI questions</w:t>
       </w:r>
     </w:p>
     <w:p>
@@ -731,16 +636,17 @@
           <w:b/>
           <w:bCs/>
         </w:rPr>
+        <w:t>Will it do the learners' work for them?</w:t>
+      </w:r>
+    </w:p>
+    <w:p>
+      <w:pPr>
+        <w:spacing w:after="160" w:line="300" w:lineRule="auto"/>
+      </w:pPr>
+      <w:r>
+        <w:t xml:space="preserve">It is designed not to. One question per turn; no answers the learner could reach themselves; practice sessions give feedback and refuse to grade; assignment-start sessions are forbidden from writing any part of the assignment, say so on screen, and decline if asked. The summary the instructor sees records </w:t>
         <w:lastRenderedPageBreak/>
-        <w:t>Will it do the learners' work for them?</w:t>
-      </w:r>
-    </w:p>
-    <w:p>
-      <w:pPr>
-        <w:spacing w:after="160" w:line="300" w:lineRule="auto"/>
-      </w:pPr>
-      <w:r>
-        <w:t>It is designed not to. One question per turn; no answers the learner could reach themselves; practice sessions give feedback and refuse to grade; assignment-start sessions are forbidden from writing any part of the assignment, say so on screen, and decline if asked. The summary the instructor sees records what the learner said and did, so a session in which the learner did no thinking is visible as such. What it cannot stop is a learner pasting the tutor's questions into another AI; nothing can.</w:t>
+        <w:t>what the learner said and did, so a session in which the learner did no thinking is visible as such. What it cannot stop is a learner pasting the tutor's questions into another AI; nothing can.</w:t>
       </w:r>
     </w:p>
     <w:p>
@@ -782,15 +688,7 @@
         <w:spacing w:after="160" w:line="300" w:lineRule="auto"/>
       </w:pPr>
       <w:r>
-        <w:t xml:space="preserve">The tool keeps the text of each session, a short summary, the learner's own "my learning" record, their ratings, and anything they type under "about you". The instructor sees summaries with names and course-wide patterns, never the learner's "about you" or "my learning". Learners can delete everything about themselves from inside the tool. Retention is a setting (indefinite by default for the pilot; </w:t>
-      </w:r>
-      <w:proofErr w:type="gramStart"/>
-      <w:r>
-        <w:t>a number of</w:t>
-      </w:r>
-      <w:proofErr w:type="gramEnd"/>
-      <w:r>
-        <w:t xml:space="preserve"> days in production). The course backup import reads course structure and content only: no users, grades, submissions or posts, and the file is deleted once read.</w:t>
+        <w:t xml:space="preserve">The tool keeps the text of each session, a short summary, the learner's own "my learning" record, their ratings, and anything they type under "about you". The instructor sees summaries with names and course-wide patterns, never the learner's "about you" or "my learning". Learners can delete everything about themselves from inside the tool. Retention is a setting (indefinite by default for the pilot; a number of days in production). The course backup import reads course structure and content only: no users, grades, submissions or posts, and the file is deleted once read.</w:t>
       </w:r>
     </w:p>
     <w:p>
@@ -811,7 +709,7 @@
         <w:spacing w:after="160" w:line="300" w:lineRule="auto"/>
       </w:pPr>
       <w:r>
-        <w:t>The application and its database run on Reclaim Cloud's Canadian region. The text of each conversational turn, with the attached materials, is sent to the model provider's API (Anthropic, in the United States) to produce the reply. Under the provider's commercial API terms that text is not used to train models; that is a contractual statement, not a technical one, and worth having IT confirm. The tool can be pointed at a different endpoint if TRU adopts a sovereign or on-premises model service; nothing else changes.</w:t>
+        <w:t xml:space="preserve">The application and its database currently run on Reclaim Cloud's Canadian region. The text of each conversational turn, with the attached materials, is sent to the model provider's API (Anthropic, in the United States) to produce the reply. Under the provider's commercial API terms that text is not used to train models; that is a contractual statement, not a technical one, and worth having IT confirm. The tool can be hosted locally, and pointed at a different endpoint if TRU adopts a sovereign or on-premises model service; nothing else changes.</w:t>
       </w:r>
     </w:p>
     <w:p>
@@ -832,15 +730,7 @@
         <w:spacing w:after="160" w:line="300" w:lineRule="auto"/>
       </w:pPr>
       <w:r>
-        <w:t xml:space="preserve">Every model call is recorded with its token counts and which session and endpoint it served, so cost per session and per course is a query, not an estimate. The tutor runs on a small, fast model with prompt caching, so </w:t>
-      </w:r>
-      <w:proofErr w:type="gramStart"/>
-      <w:r>
-        <w:t>a fifteen-minute session costs cents</w:t>
-      </w:r>
-      <w:proofErr w:type="gramEnd"/>
-      <w:r>
-        <w:t>, not dollars. The cost ledger is the place to look before scaling.</w:t>
+        <w:t xml:space="preserve">Every model call is recorded with its token counts and which session and endpoint it served, so cost per session and per course is a query, not an estimate. The tutor runs on a small, fast model with prompt caching, so a fifteen-minute session costs cents, not dollars. The cost ledger is the place to look before scaling.</w:t>
       </w:r>
     </w:p>
     <w:p>
@@ -861,11 +751,7 @@
         <w:spacing w:after="160" w:line="300" w:lineRule="auto"/>
       </w:pPr>
       <w:r>
-        <w:t xml:space="preserve">Sessions run by typing or by voice, with replies read aloud in the best voice the learner's device has. Every session has a paper version and every material a printable debrief template; a course pack bundles them for learners with poor or no connection. Each course sets a reading level and tone ("pitch") that every session honours, so an ABE course and a graduate course get the right register. The </w:t>
-      </w:r>
-      <w:r>
-        <w:lastRenderedPageBreak/>
-        <w:t>interface has had an accessibility pass (keyboard, screen reader, contrast, text size, reduced motion; docs/ACCESSIBILITY.md), but it has not yet been tested with assistive-technology users. That is a gap, and a good one for Open Learning to help close.</w:t>
+        <w:t>Sessions run by typing or by voice, with replies read aloud in the best voice the learner's device has. Every session has a paper version and every material a printable debrief template; a course pack bundles them for learners with poor or no connection. Each course sets a reading level and tone ("pitch") that every session honours, so an ABE course and a graduate course get the right register. The interface has had an accessibility pass (keyboard, screen reader, contrast, text size, reduced motion; docs/ACCESSIBILITY.md), but it has not yet been tested with assistive-technology users. That is a gap, and a good one for Open Learning to help close.</w:t>
       </w:r>
     </w:p>
     <w:p>
@@ -878,6 +764,7 @@
           <w:b/>
           <w:bCs/>
         </w:rPr>
+        <w:lastRenderedPageBreak/>
         <w:t>Does it respect open licensing?</w:t>
       </w:r>
     </w:p>
@@ -886,15 +773,7 @@
         <w:spacing w:after="160" w:line="300" w:lineRule="auto"/>
       </w:pPr>
       <w:r>
-        <w:t xml:space="preserve">The materials view is for open resources and points to the BC Open Collection, TRU Open Press and the Open Textbook Library. Imported chapters carry their licence and attribution, and the tutor names the source so learners can go to the original. The tool does not check that something an author pastes </w:t>
-      </w:r>
-      <w:proofErr w:type="gramStart"/>
-      <w:r>
-        <w:t>is</w:t>
-      </w:r>
-      <w:proofErr w:type="gramEnd"/>
-      <w:r>
-        <w:t xml:space="preserve"> open; that remains the author's responsibility, as it is now.</w:t>
+        <w:t xml:space="preserve">The materials view is for open resources and points to the BC Open Collection, TRU Open Press and the Open Textbook Library. Imported chapters carry their licence and attribution, and the tutor names the source so learners can go to the original. The tool does not check that something an author pastes is open; that remains the author's responsibility, as it is now.</w:t>
       </w:r>
     </w:p>
     <w:p>
@@ -962,7 +841,7 @@
         <w:t>Import the course</w:t>
       </w:r>
       <w:r>
-        <w:t xml:space="preserve"> once from a backup. The unit arrives as its text, its activities and study questions, the reading with its PDF, and the assignment with its rubric, each marked for what it is.</w:t>
+        <w:t xml:space="preserve"> once from a backup, or sync it live through Moodle web services. The unit arrives as its text, its activities and study questions, the reading with its PDF, and the assignment with its rubric, each marked for what it is.</w:t>
       </w:r>
     </w:p>
     <w:p>
@@ -999,27 +878,10 @@
           <w:b/>
           <w:bCs/>
         </w:rPr>
-        <w:t xml:space="preserve">Preparation </w:t>
-      </w:r>
-      <w:proofErr w:type="gramStart"/>
-      <w:r>
-        <w:rPr>
-          <w:b/>
-          <w:bCs/>
-        </w:rPr>
-        <w:t>check</w:t>
-      </w:r>
-      <w:proofErr w:type="gramEnd"/>
-      <w:r>
-        <w:t xml:space="preserve"> after the </w:t>
-      </w:r>
-      <w:proofErr w:type="gramStart"/>
-      <w:r>
-        <w:t>reading:</w:t>
-      </w:r>
-      <w:proofErr w:type="gramEnd"/>
-      <w:r>
-        <w:t xml:space="preserve"> did the key ideas land. Draft it with the reading ticked; the probes come from the chapter.</w:t>
+        <w:t xml:space="preserve">Preparation check</w:t>
+      </w:r>
+      <w:r>
+        <w:t xml:space="preserve"> after the reading: did the key ideas land. Draft it with the reading ticked; the probes come from the chapter.</w:t>
       </w:r>
     </w:p>
     <w:p>
@@ -1056,17 +918,8 @@
           <w:b/>
           <w:bCs/>
         </w:rPr>
-        <w:t xml:space="preserve">Assignment </w:t>
-      </w:r>
-      <w:proofErr w:type="gramStart"/>
-      <w:r>
-        <w:rPr>
-          <w:b/>
-          <w:bCs/>
-        </w:rPr>
-        <w:t>start</w:t>
-      </w:r>
-      <w:proofErr w:type="gramEnd"/>
+        <w:t xml:space="preserve">Assignment start</w:t>
+      </w:r>
       <w:r>
         <w:t xml:space="preserve"> beneath the assignment. Draft it with the assignment, the reading and the activities ticked. The learner leaves with their own understanding of the task, a plan and a first step; the OLFM sees who could not start.</w:t>
       </w:r>
@@ -1128,7 +981,6 @@
           <w:sz w:val="30"/>
           <w:szCs w:val="30"/>
         </w:rPr>
-        <w:lastRenderedPageBreak/>
         <w:t>5. A brief-review checklist</w:t>
       </w:r>
     </w:p>
@@ -1154,6 +1006,7 @@
           <w:b/>
           <w:bCs/>
         </w:rPr>
+        <w:lastRenderedPageBreak/>
         <w:t>One goal.</w:t>
       </w:r>
       <w:r>
@@ -1177,15 +1030,7 @@
         <w:t>An opening question a cold learner can answer.</w:t>
       </w:r>
       <w:r>
-        <w:t xml:space="preserve"> In a self-paced </w:t>
-      </w:r>
-      <w:proofErr w:type="gramStart"/>
-      <w:r>
-        <w:t>course</w:t>
-      </w:r>
-      <w:proofErr w:type="gramEnd"/>
-      <w:r>
-        <w:t xml:space="preserve"> the learner may arrive without having read anything yet. Does the first question stand on its own?</w:t>
+        <w:t xml:space="preserve"> In a self-paced course the learner may arrive without having read anything yet. Does the first question stand on its own?</w:t>
       </w:r>
     </w:p>
     <w:p>
@@ -1389,10 +1234,7 @@
         <w:spacing w:after="100" w:line="300" w:lineRule="auto"/>
       </w:pPr>
       <w:r>
-        <w:t xml:space="preserve">It has not been through assistive-technology user testing, </w:t>
-      </w:r>
-      <w:r>
-        <w:t>nor much user testing yet for that matter.</w:t>
+        <w:t xml:space="preserve">It has not been through assistive-technology user testing, and no real students have used it yet. Two rounds of testing from the student’s side, with staff and simulated students on a COMP 2131 module in October, led to thirteen fixes.</w:t>
       </w:r>
     </w:p>
     <w:p>
@@ -1408,15 +1250,7 @@
           <w:sz w:val="18"/>
           <w:szCs w:val="18"/>
         </w:rPr>
-        <w:t>d</w:t>
-      </w:r>
-      <w:r>
-        <w:rPr>
-          <w:color w:val="5D6474"/>
-          <w:sz w:val="18"/>
-          <w:szCs w:val="18"/>
-        </w:rPr>
-        <w:t>ocs/ALIGNMENT.md, accessibility in docs/ACCESSIBILITY.md, the instructor guide in docs/USER-GUIDE.md).</w:t>
+        <w:t>Full documentation: README.md and docs/ in the repository (delivery modes in docs/ALIGNMENT.md, accessibility in docs/ACCESSIBILITY.md, the instructor guide in docs/USER-GUIDE.md).</w:t>
       </w:r>
     </w:p>
     <w:sectPr>

</xml_diff>

<commit_message>
Overviews: keep Oct 13 as written; add the COMP 2131 Module 8 overview
The Oct 13 overview goes back to Brian's text, kept as a record of that
date. The COMP 2131 overview for the course's designer is added, dated
Oct 21, with the teach-back described as the tutor does it: it keeps
asking for up to two more turns until the student explains in their own
words.

Co-Authored-By: Claude Opus 5.5 <noreply@anthropic.com>
</commit_message>
<xml_diff>
--- a/docs/LTI-Tutor-Overview-Oct13.docx
+++ b/docs/LTI-Tutor-Overview-Oct13.docx
@@ -13,7 +13,15 @@
           <w:sz w:val="44"/>
           <w:szCs w:val="44"/>
         </w:rPr>
-        <w:t xml:space="preserve">LTI Tutor Overview</w:t>
+        <w:t xml:space="preserve">LTI Tutor </w:t>
+      </w:r>
+      <w:r>
+        <w:rPr>
+          <w:color w:val="1F2430"/>
+          <w:sz w:val="44"/>
+          <w:szCs w:val="44"/>
+        </w:rPr>
+        <w:t>Overview</w:t>
       </w:r>
     </w:p>
     <w:p>
@@ -26,7 +34,63 @@
           <w:sz w:val="24"/>
           <w:szCs w:val="24"/>
         </w:rPr>
-        <w:t xml:space="preserve">An overview of what this tool is, how it sits inside a Moodle course design, and how it relates to the questions we all have about generative AI in courses.</w:t>
+        <w:t>A</w:t>
+      </w:r>
+      <w:r>
+        <w:rPr>
+          <w:color w:val="5D6474"/>
+          <w:sz w:val="24"/>
+          <w:szCs w:val="24"/>
+        </w:rPr>
+        <w:t>n</w:t>
+      </w:r>
+      <w:r>
+        <w:rPr>
+          <w:color w:val="5D6474"/>
+          <w:sz w:val="24"/>
+          <w:szCs w:val="24"/>
+        </w:rPr>
+        <w:t xml:space="preserve"> overview of</w:t>
+      </w:r>
+      <w:r>
+        <w:rPr>
+          <w:color w:val="5D6474"/>
+          <w:sz w:val="24"/>
+          <w:szCs w:val="24"/>
+        </w:rPr>
+        <w:t xml:space="preserve"> what this tool is, how it sits inside a </w:t>
+      </w:r>
+      <w:r>
+        <w:rPr>
+          <w:color w:val="5D6474"/>
+          <w:sz w:val="24"/>
+          <w:szCs w:val="24"/>
+        </w:rPr>
+        <w:t xml:space="preserve">Moodle </w:t>
+      </w:r>
+      <w:r>
+        <w:rPr>
+          <w:color w:val="5D6474"/>
+          <w:sz w:val="24"/>
+          <w:szCs w:val="24"/>
+        </w:rPr>
+        <w:t xml:space="preserve">course design, and </w:t>
+      </w:r>
+      <w:r>
+        <w:rPr>
+          <w:color w:val="5D6474"/>
+          <w:sz w:val="24"/>
+          <w:szCs w:val="24"/>
+        </w:rPr>
+        <w:t>how it relates to</w:t>
+      </w:r>
+      <w:r>
+        <w:rPr>
+          <w:color w:val="5D6474"/>
+          <w:sz w:val="24"/>
+          <w:szCs w:val="24"/>
+        </w:rPr>
+        <w:t xml:space="preserve"> the questions we all have about generative AI in courses.</w:t>
       </w:r>
     </w:p>
     <w:p>
@@ -34,7 +98,13 @@
         <w:spacing w:after="160" w:line="300" w:lineRule="auto"/>
       </w:pPr>
       <w:r>
-        <w:t xml:space="preserve">Most GenAI tools offer to generate content. This one is built on the opposite premise. It asks questions, following a brief the course author writes, and it draws only on the materials the course gives it. The learner does the thinking; the instructor keeps the authority; nothing it produces is a grade, a lesson or a submission. </w:t>
+        <w:t>Most GenAI tools offer</w:t>
+      </w:r>
+      <w:r>
+        <w:t xml:space="preserve"> </w:t>
+      </w:r>
+      <w:r>
+        <w:t xml:space="preserve">to generate content. This one is built on the opposite premise. It asks questions, following a brief the course author writes, and it draws only on the materials the course gives it. The learner does the thinking; the instructor keeps the authority; nothing it produces is a grade, a lesson or a submission. </w:t>
       </w:r>
     </w:p>
     <w:p>
@@ -71,7 +141,15 @@
         <w:t>brief</w:t>
       </w:r>
       <w:r>
-        <w:t xml:space="preserve">: a page of plain prose the course author (or you, with them) writes, in the voice of notes to a good teaching assistant. A learning goal, an opening question, the three to five probes to work through, the misconceptions to listen for, and what "got it" sounds like. The tutor follows the brief; the brief is reviewable, versionable text, not a prompt buried in a product.</w:t>
+        <w:t xml:space="preserve">: a page of plain prose the course author (or you, with them) writes, in the voice of notes to a good teaching assistant. A learning goal, an opening question, the three to five probes to work through, the misconceptions to listen for, and what "got it" sounds like. The tutor follows the brief; the brief is reviewable, </w:t>
+      </w:r>
+      <w:proofErr w:type="spellStart"/>
+      <w:r>
+        <w:t>versionable</w:t>
+      </w:r>
+      <w:proofErr w:type="spellEnd"/>
+      <w:r>
+        <w:t xml:space="preserve"> text, not a prompt buried in a product.</w:t>
       </w:r>
     </w:p>
     <w:p>
@@ -210,7 +288,7 @@
                 <w:sz w:val="20"/>
                 <w:szCs w:val="20"/>
               </w:rPr>
-              <w:t>Diagnostic before a unit. A false fact is corrected in one sentence, without teaching; the wrap-up says what to watch for.</w:t>
+              <w:t>Diagnostic before a unit. Misconceptions are noted, not corrected; the wrap-up says what to watch for.</w:t>
             </w:r>
           </w:p>
         </w:tc>
@@ -488,8 +566,19 @@
                 <w:szCs w:val="20"/>
               </w:rPr>
               <w:lastRenderedPageBreak/>
-              <w:t xml:space="preserve">Assignment start</w:t>
+              <w:t xml:space="preserve">Assignment </w:t>
             </w:r>
+            <w:proofErr w:type="gramStart"/>
+            <w:r>
+              <w:rPr>
+                <w:b/>
+                <w:bCs/>
+                <w:sz w:val="20"/>
+                <w:szCs w:val="20"/>
+              </w:rPr>
+              <w:t>start</w:t>
+            </w:r>
+            <w:proofErr w:type="gramEnd"/>
           </w:p>
         </w:tc>
         <w:tc>
@@ -553,7 +642,23 @@
         <w:t>It follows the delivery mode.</w:t>
       </w:r>
       <w:r>
-        <w:t xml:space="preserve"> A course is set to its TRUFlex mode once, and every session's wording keys on what the course actually has: live sessions, a cohort, fixed dates. A self-paced, continuous-entry course never hears "before class" or "your classmates" and gets no date-based nudges; a paced course gets weekly grouping and "the cohort has moved on" reminders. The same deployment serves all ten modes, and docs/ALIGNMENT.md in the repository lists every wording switch.</w:t>
+        <w:t xml:space="preserve"> A course is set to its </w:t>
+      </w:r>
+      <w:proofErr w:type="spellStart"/>
+      <w:r>
+        <w:t>TRUFlex</w:t>
+      </w:r>
+      <w:proofErr w:type="spellEnd"/>
+      <w:r>
+        <w:t xml:space="preserve"> mode once, and every session's wording keys on what the course </w:t>
+      </w:r>
+      <w:proofErr w:type="gramStart"/>
+      <w:r>
+        <w:t>actually has</w:t>
+      </w:r>
+      <w:proofErr w:type="gramEnd"/>
+      <w:r>
+        <w:t>: live sessions, a cohort, fixed dates. A self-paced, continuous-entry course never hears "before class" or "your classmates" and gets no date-based nudges; a paced course gets weekly grouping and "the cohort has moved on" reminders. The same deployment serves all ten modes, and docs/ALIGNMENT.md in the repository lists every wording switch.</w:t>
       </w:r>
     </w:p>
     <w:p>
@@ -580,10 +685,30 @@
           <w:b/>
           <w:bCs/>
         </w:rPr>
-        <w:t xml:space="preserve">It draws only on what the designer gives it.</w:t>
-      </w:r>
-      <w:r>
-        <w:t xml:space="preserve"> Materials come from the course: a Moodle course synch brings the units in with their text, readings, activities and assignments, each marked for what it is. The course's own activity and study questions become the tutor's probes before it invents any. An assignment description is treated as the task, never as a source to teach from. If a session has no materials, the tutor is working from general knowledge, and the editor says so.</w:t>
+        <w:t xml:space="preserve">It draws only on what the </w:t>
+      </w:r>
+      <w:r>
+        <w:rPr>
+          <w:b/>
+          <w:bCs/>
+        </w:rPr>
+        <w:t>designer</w:t>
+      </w:r>
+      <w:r>
+        <w:rPr>
+          <w:b/>
+          <w:bCs/>
+        </w:rPr>
+        <w:t xml:space="preserve"> gives it.</w:t>
+      </w:r>
+      <w:r>
+        <w:t xml:space="preserve"> Materials come from the course: a Moodle </w:t>
+      </w:r>
+      <w:r>
+        <w:t xml:space="preserve">course synch </w:t>
+      </w:r>
+      <w:r>
+        <w:t>brings the units in with their text, readings, activities and assignments, each marked for what it is. The course's own activity and study questions become the tutor's probes before it invents any. An assignment description is treated as the task, never as a source to teach from. If a session has no materials, the tutor is working from general knowledge, and the editor says so.</w:t>
       </w:r>
     </w:p>
     <w:p>
@@ -645,6 +770,8 @@
       </w:pPr>
       <w:r>
         <w:t xml:space="preserve">It is designed not to. One question per turn; no answers the learner could reach themselves; practice sessions give feedback and refuse to grade; assignment-start sessions are forbidden from writing any part of the assignment, say so on screen, and decline if asked. The summary the instructor sees records </w:t>
+      </w:r>
+      <w:r>
         <w:lastRenderedPageBreak/>
         <w:t>what the learner said and did, so a session in which the learner did no thinking is visible as such. What it cannot stop is a learner pasting the tutor's questions into another AI; nothing can.</w:t>
       </w:r>
@@ -688,7 +815,15 @@
         <w:spacing w:after="160" w:line="300" w:lineRule="auto"/>
       </w:pPr>
       <w:r>
-        <w:t xml:space="preserve">The tool keeps the text of each session, a short summary, the learner's own "my learning" record, their ratings, and anything they type under "about you". The instructor sees summaries with names and course-wide patterns, never the learner's "about you" or "my learning". Learners can delete everything about themselves from inside the tool. Retention is a setting (indefinite by default for the pilot; a number of days in production). The course backup import reads course structure and content only: no users, grades, submissions or posts, and the file is deleted once read.</w:t>
+        <w:t xml:space="preserve">The tool keeps the text of each session, a short summary, the learner's own "my learning" record, their ratings, and anything they type under "about you". The instructor sees summaries with names and course-wide patterns, never the learner's "about you" or "my learning". Learners can delete everything about themselves from inside the tool. Retention is a setting (indefinite by default for the pilot; </w:t>
+      </w:r>
+      <w:proofErr w:type="gramStart"/>
+      <w:r>
+        <w:t>a number of</w:t>
+      </w:r>
+      <w:proofErr w:type="gramEnd"/>
+      <w:r>
+        <w:t xml:space="preserve"> days in production). The course backup import reads course structure and content only: no users, grades, submissions or posts, and the file is deleted once read.</w:t>
       </w:r>
     </w:p>
     <w:p>
@@ -709,7 +844,19 @@
         <w:spacing w:after="160" w:line="300" w:lineRule="auto"/>
       </w:pPr>
       <w:r>
-        <w:t xml:space="preserve">The application and its database currently run on Reclaim Cloud's Canadian region. The text of each conversational turn, with the attached materials, is sent to the model provider's API (Anthropic, in the United States) to produce the reply. Under the provider's commercial API terms that text is not used to train models; that is a contractual statement, not a technical one, and worth having IT confirm. The tool can be hosted locally, and pointed at a different endpoint if TRU adopts a sovereign or on-premises model service; nothing else changes.</w:t>
+        <w:t xml:space="preserve">The application and its database </w:t>
+      </w:r>
+      <w:r>
+        <w:t xml:space="preserve">currently </w:t>
+      </w:r>
+      <w:r>
+        <w:t>run on Reclaim Cloud's Canadian region. The text of each conversational turn, with the attached materials, is sent to the model provider's API (Anthropic, in the United States) to produce the reply. Under the provider's commercial API terms that text is not used to train models; that is a contractual statement, not a technical one, and worth having IT confirm. The tool can be</w:t>
+      </w:r>
+      <w:r>
+        <w:t xml:space="preserve"> hosted locally, and</w:t>
+      </w:r>
+      <w:r>
+        <w:t xml:space="preserve"> pointed at a different endpoint if TRU adopts a sovereign or on-premises model service; nothing else changes.</w:t>
       </w:r>
     </w:p>
     <w:p>
@@ -730,7 +877,15 @@
         <w:spacing w:after="160" w:line="300" w:lineRule="auto"/>
       </w:pPr>
       <w:r>
-        <w:t xml:space="preserve">Every model call is recorded with its token counts and which session and endpoint it served, so cost per session and per course is a query, not an estimate. The tutor runs on a small, fast model with prompt caching, so a fifteen-minute session costs cents, not dollars. The cost ledger is the place to look before scaling.</w:t>
+        <w:t xml:space="preserve">Every model call is recorded with its token counts and which session and endpoint it served, so cost per session and per course is a query, not an estimate. The tutor runs on a small, fast model with prompt caching, so </w:t>
+      </w:r>
+      <w:proofErr w:type="gramStart"/>
+      <w:r>
+        <w:t>a fifteen-minute session costs cents</w:t>
+      </w:r>
+      <w:proofErr w:type="gramEnd"/>
+      <w:r>
+        <w:t>, not dollars. The cost ledger is the place to look before scaling.</w:t>
       </w:r>
     </w:p>
     <w:p>
@@ -773,7 +928,15 @@
         <w:spacing w:after="160" w:line="300" w:lineRule="auto"/>
       </w:pPr>
       <w:r>
-        <w:t xml:space="preserve">The materials view is for open resources and points to the BC Open Collection, TRU Open Press and the Open Textbook Library. Imported chapters carry their licence and attribution, and the tutor names the source so learners can go to the original. The tool does not check that something an author pastes is open; that remains the author's responsibility, as it is now.</w:t>
+        <w:t xml:space="preserve">The materials view is for open resources and points to the BC Open Collection, TRU Open Press and the Open Textbook Library. Imported chapters carry their licence and attribution, and the tutor names the source so learners can go to the original. The tool does not check that something an author pastes </w:t>
+      </w:r>
+      <w:proofErr w:type="gramStart"/>
+      <w:r>
+        <w:t>is</w:t>
+      </w:r>
+      <w:proofErr w:type="gramEnd"/>
+      <w:r>
+        <w:t xml:space="preserve"> open; that remains the author's responsibility, as it is now.</w:t>
       </w:r>
     </w:p>
     <w:p>
@@ -841,7 +1004,7 @@
         <w:t>Import the course</w:t>
       </w:r>
       <w:r>
-        <w:t xml:space="preserve"> once from a backup, or sync it live through Moodle web services. The unit arrives as its text, its activities and study questions, the reading with its PDF, and the assignment with its rubric, each marked for what it is.</w:t>
+        <w:t xml:space="preserve"> once from a backup. The unit arrives as its text, its activities and study questions, the reading with its PDF, and the assignment with its rubric, each marked for what it is.</w:t>
       </w:r>
     </w:p>
     <w:p>
@@ -878,10 +1041,27 @@
           <w:b/>
           <w:bCs/>
         </w:rPr>
-        <w:t xml:space="preserve">Preparation check</w:t>
-      </w:r>
-      <w:r>
-        <w:t xml:space="preserve"> after the reading: did the key ideas land. Draft it with the reading ticked; the probes come from the chapter.</w:t>
+        <w:t xml:space="preserve">Preparation </w:t>
+      </w:r>
+      <w:proofErr w:type="gramStart"/>
+      <w:r>
+        <w:rPr>
+          <w:b/>
+          <w:bCs/>
+        </w:rPr>
+        <w:t>check</w:t>
+      </w:r>
+      <w:proofErr w:type="gramEnd"/>
+      <w:r>
+        <w:t xml:space="preserve"> after the </w:t>
+      </w:r>
+      <w:proofErr w:type="gramStart"/>
+      <w:r>
+        <w:t>reading:</w:t>
+      </w:r>
+      <w:proofErr w:type="gramEnd"/>
+      <w:r>
+        <w:t xml:space="preserve"> did the key ideas land. Draft it with the reading ticked; the probes come from the chapter.</w:t>
       </w:r>
     </w:p>
     <w:p>
@@ -918,8 +1098,17 @@
           <w:b/>
           <w:bCs/>
         </w:rPr>
-        <w:t xml:space="preserve">Assignment start</w:t>
-      </w:r>
+        <w:t xml:space="preserve">Assignment </w:t>
+      </w:r>
+      <w:proofErr w:type="gramStart"/>
+      <w:r>
+        <w:rPr>
+          <w:b/>
+          <w:bCs/>
+        </w:rPr>
+        <w:t>start</w:t>
+      </w:r>
+      <w:proofErr w:type="gramEnd"/>
       <w:r>
         <w:t xml:space="preserve"> beneath the assignment. Draft it with the assignment, the reading and the activities ticked. The learner leaves with their own understanding of the task, a plan and a first step; the OLFM sees who could not start.</w:t>
       </w:r>
@@ -1030,7 +1219,15 @@
         <w:t>An opening question a cold learner can answer.</w:t>
       </w:r>
       <w:r>
-        <w:t xml:space="preserve"> In a self-paced course the learner may arrive without having read anything yet. Does the first question stand on its own?</w:t>
+        <w:t xml:space="preserve"> In a self-paced </w:t>
+      </w:r>
+      <w:proofErr w:type="gramStart"/>
+      <w:r>
+        <w:t>course</w:t>
+      </w:r>
+      <w:proofErr w:type="gramEnd"/>
+      <w:r>
+        <w:t xml:space="preserve"> the learner may arrive without having read anything yet. Does the first question stand on its own?</w:t>
       </w:r>
     </w:p>
     <w:p>
@@ -1234,7 +1431,10 @@
         <w:spacing w:after="100" w:line="300" w:lineRule="auto"/>
       </w:pPr>
       <w:r>
-        <w:t xml:space="preserve">It has not been through assistive-technology user testing, and no real students have used it yet. Two rounds of testing from the student’s side, with staff and simulated students on a COMP 2131 module in October, led to thirteen fixes.</w:t>
+        <w:t xml:space="preserve">It has not been through assistive-technology user testing, </w:t>
+      </w:r>
+      <w:r>
+        <w:t>nor much user testing yet for that matter.</w:t>
       </w:r>
     </w:p>
     <w:p>
@@ -1250,7 +1450,7 @@
           <w:sz w:val="18"/>
           <w:szCs w:val="18"/>
         </w:rPr>
-        <w:t>Full documentation: README.md and docs/ in the repository (delivery modes in docs/ALIGNMENT.md, accessibility in docs/ACCESSIBILITY.md, the instructor guide in docs/USER-GUIDE.md).</w:t>
+        <w:t>docs/ALIGNMENT.md, accessibility in docs/ACCESSIBILITY.md, the instructor guide in docs/USER-GUIDE.md).</w:t>
       </w:r>
     </w:p>
     <w:sectPr>

</xml_diff>